<commit_message>
Add manuscript highlights main figure
</commit_message>
<xml_diff>
--- a/manuscript/annals/manuscript.docx
+++ b/manuscript/annals/manuscript.docx
@@ -27,7 +27,7 @@
         <w:t>Annals of the New York Academy of Sciences</w:t>
       </w:r>
       <w:r>
-        <w:t xml:space="preserve">)  </w:t>
+        <w:t>)</w:t>
       </w:r>
     </w:p>
     <w:p>
@@ -38,7 +38,7 @@
         <w:t>Authors:</w:t>
       </w:r>
       <w:r>
-        <w:t xml:space="preserve"> [AUTHOR NAMES IN FINAL ORDER]  </w:t>
+        <w:t xml:space="preserve"> [AUTHOR NAMES IN FINAL ORDER]</w:t>
       </w:r>
     </w:p>
     <w:p>
@@ -49,7 +49,7 @@
         <w:t>Affiliations:</w:t>
       </w:r>
       <w:r>
-        <w:t xml:space="preserve"> [AFFILIATIONS]  </w:t>
+        <w:t xml:space="preserve"> [AFFILIATIONS]</w:t>
       </w:r>
     </w:p>
     <w:p>
@@ -60,7 +60,7 @@
         <w:t>Corresponding author:</w:t>
       </w:r>
       <w:r>
-        <w:t xml:space="preserve"> [NAME, EMAIL, POSTAL ADDRESS]  </w:t>
+        <w:t xml:space="preserve"> [NAME, EMAIL, POSTAL ADDRESS]</w:t>
       </w:r>
     </w:p>
     <w:p>
@@ -932,10 +932,10 @@
         <w:rPr>
           <w:b/>
         </w:rPr>
-        <w:t>Figure 1. PhytoScope data flow and scope.</w:t>
+        <w:t>Figure 1. PhytoScope framework, evaluation highlights, and interpretation boundaries.</w:t>
       </w:r>
       <w:r>
-        <w:t xml:space="preserve"> User-provided annotation, matching genome sequence, expression values, and sample metadata enter a local project. The software links files to locus search, structure view, sequence extraction, expression display, and selected analysis modules. Project state and results can be saved and reopened. Annotation-derived, sequence-derived, and user-entered information are shown as separate inputs; no function, orthology, causal regulation, or differential expression is inferred.</w:t>
+        <w:t xml:space="preserve"> User-provided annotation, matching genome sequence, expression values, and sample metadata enter a local locus-centered workspace for gene search, structure inspection, sequence export, expression display, and project persistence. Evaluation included seven plant species, 4,641,758 recognized structural tuples across eight independent source inventories (zero missing or extra tuples), selected sequence gold standards in three additional plants, and exact reconciliation of 34,914 rice-bean expression gene identifiers. The rice-bean reads came from genotype IC426787 and were quantified against the VRB3 reference, so this supports import and identifier compatibility only. The framework organizes user-provided data and does not infer function, orthology, causal regulation, or differential expression.</w:t>
       </w:r>
     </w:p>
     <w:p>

</xml_diff>